<commit_message>
3_Genetic_Correlation folder is added.
</commit_message>
<xml_diff>
--- a/README.docx
+++ b/README.docx
@@ -930,7 +930,25 @@
         <w:rPr>
           <w:rFonts w:hint="eastAsia"/>
         </w:rPr>
-        <w:t xml:space="preserve"> for use in LDSC analyses</w:t>
+        <w:t xml:space="preserve"> of smoking initiation</w:t>
+      </w:r>
+      <w:r>
+        <w:rPr>
+          <w:rFonts w:hint="eastAsia"/>
+        </w:rPr>
+        <w:t xml:space="preserve"> </w:t>
+      </w:r>
+      <w:r>
+        <w:rPr>
+          <w:rFonts w:hint="eastAsia"/>
+        </w:rPr>
+        <w:t>to</w:t>
+      </w:r>
+      <w:r>
+        <w:rPr>
+          <w:rFonts w:hint="eastAsia"/>
+        </w:rPr>
+        <w:t xml:space="preserve"> use in LDSC analyses</w:t>
       </w:r>
       <w:r>
         <w:rPr>
@@ -1079,13 +1097,228 @@
           <w:numId w:val="3"/>
         </w:numPr>
         <w:jc w:val="both"/>
-      </w:pPr>
-      <w:r>
-        <w:rPr>
-          <w:rFonts w:hint="eastAsia"/>
+        <w:rPr>
+          <w:b/>
+          <w:bCs/>
+        </w:rPr>
+      </w:pPr>
+      <w:r>
+        <w:rPr>
+          <w:rFonts w:hint="eastAsia"/>
+          <w:b/>
+          <w:bCs/>
         </w:rPr>
         <w:t>Genetic Correlation</w:t>
       </w:r>
+    </w:p>
+    <w:p>
+      <w:pPr>
+        <w:pStyle w:val="ListParagraph"/>
+        <w:jc w:val="both"/>
+      </w:pPr>
+      <w:r>
+        <w:rPr>
+          <w:rFonts w:hint="eastAsia"/>
+        </w:rPr>
+        <w:t>This folder contains two subfolders</w:t>
+      </w:r>
+      <w:r>
+        <w:rPr>
+          <w:rFonts w:hint="eastAsia"/>
+        </w:rPr>
+        <w:t>.</w:t>
+      </w:r>
+      <w:r>
+        <w:rPr>
+          <w:rFonts w:hint="eastAsia"/>
+        </w:rPr>
+        <w:t xml:space="preserve"> </w:t>
+      </w:r>
+      <w:r>
+        <w:t>Genetic_Correlation_SI_Subgroups</w:t>
+      </w:r>
+      <w:r>
+        <w:rPr>
+          <w:rFonts w:hint="eastAsia"/>
+        </w:rPr>
+        <w:t xml:space="preserve"> subfolder includes </w:t>
+      </w:r>
+      <w:r>
+        <w:rPr>
+          <w:rFonts w:hint="eastAsia"/>
+        </w:rPr>
+        <w:t xml:space="preserve">bash and R scripts used to estimate genetic correlation of smoking initiation across subgroups. </w:t>
+      </w:r>
+      <w:r>
+        <w:t>Genetic_Correlation_SI_Other_Traits</w:t>
+      </w:r>
+      <w:r>
+        <w:rPr>
+          <w:rFonts w:hint="eastAsia"/>
+        </w:rPr>
+        <w:t xml:space="preserve"> sub</w:t>
+      </w:r>
+      <w:r>
+        <w:rPr>
+          <w:rFonts w:hint="eastAsia"/>
+        </w:rPr>
+        <w:t>folder includes bash and R scripts used to estimate genetic correlation between smoking initiation and other traits.</w:t>
+      </w:r>
+    </w:p>
+    <w:p>
+      <w:pPr>
+        <w:pStyle w:val="ListParagraph"/>
+        <w:jc w:val="both"/>
+        <w:rPr>
+          <w:rFonts w:hint="eastAsia"/>
+          <w:i/>
+          <w:iCs/>
+        </w:rPr>
+      </w:pPr>
+      <w:r>
+        <w:rPr>
+          <w:i/>
+          <w:iCs/>
+        </w:rPr>
+        <w:t>Genetic_Correlation_SI_Subgroups</w:t>
+      </w:r>
+    </w:p>
+    <w:p>
+      <w:pPr>
+        <w:pStyle w:val="ListParagraph"/>
+        <w:numPr>
+          <w:ilvl w:val="1"/>
+          <w:numId w:val="3"/>
+        </w:numPr>
+        <w:jc w:val="both"/>
+        <w:rPr>
+          <w:i/>
+          <w:iCs/>
+        </w:rPr>
+      </w:pPr>
+      <w:r>
+        <w:rPr>
+          <w:i/>
+          <w:iCs/>
+        </w:rPr>
+        <w:t>European_Genetic_Correlation_23andmeSI</w:t>
+      </w:r>
+      <w:r>
+        <w:rPr>
+          <w:rFonts w:hint="eastAsia"/>
+          <w:i/>
+          <w:iCs/>
+        </w:rPr>
+        <w:t>.sh</w:t>
+      </w:r>
+    </w:p>
+    <w:p>
+      <w:pPr>
+        <w:pStyle w:val="ListParagraph"/>
+        <w:numPr>
+          <w:ilvl w:val="2"/>
+          <w:numId w:val="3"/>
+        </w:numPr>
+        <w:jc w:val="both"/>
+      </w:pPr>
+      <w:r>
+        <w:rPr>
+          <w:rFonts w:hint="eastAsia"/>
+        </w:rPr>
+        <w:t>This script estimates genetic correlation between subgroups using munged G</w:t>
+      </w:r>
+      <w:r>
+        <w:rPr>
+          <w:rFonts w:hint="eastAsia"/>
+        </w:rPr>
+        <w:t>WAS summary statistics of smoking initiation</w:t>
+      </w:r>
+      <w:r>
+        <w:rPr>
+          <w:rFonts w:hint="eastAsia"/>
+        </w:rPr>
+        <w:t xml:space="preserve"> using LDSC.</w:t>
+      </w:r>
+    </w:p>
+    <w:p>
+      <w:pPr>
+        <w:pStyle w:val="ListParagraph"/>
+        <w:numPr>
+          <w:ilvl w:val="1"/>
+          <w:numId w:val="3"/>
+        </w:numPr>
+        <w:jc w:val="both"/>
+      </w:pPr>
+      <w:r>
+        <w:rPr>
+          <w:i/>
+          <w:iCs/>
+        </w:rPr>
+        <w:t>European_Genetic_Correlation_23andmeSI_Tables_Figures</w:t>
+      </w:r>
+      <w:r>
+        <w:rPr>
+          <w:rFonts w:hint="eastAsia"/>
+          <w:i/>
+          <w:iCs/>
+        </w:rPr>
+        <w:t>.</w:t>
+      </w:r>
+      <w:r>
+        <w:rPr>
+          <w:rFonts w:hint="eastAsia"/>
+          <w:i/>
+          <w:iCs/>
+        </w:rPr>
+        <w:t>r</w:t>
+      </w:r>
+    </w:p>
+    <w:p>
+      <w:pPr>
+        <w:pStyle w:val="ListParagraph"/>
+        <w:numPr>
+          <w:ilvl w:val="2"/>
+          <w:numId w:val="3"/>
+        </w:numPr>
+        <w:jc w:val="both"/>
+      </w:pPr>
+      <w:r>
+        <w:rPr>
+          <w:rFonts w:hint="eastAsia"/>
+        </w:rPr>
+        <w:t>This script generates figures summarizing the genetic correlation estimates</w:t>
+      </w:r>
+    </w:p>
+    <w:p>
+      <w:pPr>
+        <w:pStyle w:val="ListParagraph"/>
+        <w:jc w:val="both"/>
+        <w:rPr>
+          <w:i/>
+          <w:iCs/>
+        </w:rPr>
+      </w:pPr>
+      <w:r>
+        <w:rPr>
+          <w:i/>
+          <w:iCs/>
+        </w:rPr>
+        <w:lastRenderedPageBreak/>
+        <w:t>Genetic_Correlation_SI_Other_Traits</w:t>
+      </w:r>
+    </w:p>
+    <w:p>
+      <w:pPr>
+        <w:pStyle w:val="ListParagraph"/>
+        <w:numPr>
+          <w:ilvl w:val="1"/>
+          <w:numId w:val="3"/>
+        </w:numPr>
+        <w:jc w:val="both"/>
+        <w:rPr>
+          <w:rFonts w:hint="eastAsia"/>
+        </w:rPr>
+      </w:pPr>
     </w:p>
     <w:p>
       <w:pPr>
@@ -1259,7 +1492,6 @@
         <w:rPr>
           <w:rFonts w:hint="eastAsia"/>
         </w:rPr>
-        <w:lastRenderedPageBreak/>
         <w:t>METAL</w:t>
       </w:r>
     </w:p>
@@ -1686,7 +1918,7 @@
   <w:abstractNum w:abstractNumId="2" w15:restartNumberingAfterBreak="0">
     <w:nsid w:val="79DB0A8F"/>
     <w:multiLevelType w:val="hybridMultilevel"/>
-    <w:tmpl w:val="7CCAF47A"/>
+    <w:tmpl w:val="447A8746"/>
     <w:lvl w:ilvl="0" w:tplc="0409000F">
       <w:start w:val="1"/>
       <w:numFmt w:val="decimal"/>
@@ -1708,7 +1940,7 @@
         <w:ind w:left="1440" w:hanging="360"/>
       </w:pPr>
     </w:lvl>
-    <w:lvl w:ilvl="2" w:tplc="0409001B">
+    <w:lvl w:ilvl="2" w:tplc="F7AE7106">
       <w:start w:val="1"/>
       <w:numFmt w:val="lowerRoman"/>
       <w:lvlText w:val="%3."/>
@@ -1716,6 +1948,10 @@
       <w:pPr>
         <w:ind w:left="2160" w:hanging="180"/>
       </w:pPr>
+      <w:rPr>
+        <w:i w:val="0"/>
+        <w:iCs w:val="0"/>
+      </w:rPr>
     </w:lvl>
     <w:lvl w:ilvl="3" w:tplc="0409000F" w:tentative="1">
       <w:start w:val="1"/>

</xml_diff>

<commit_message>
Folders 10 and 11 are added.
</commit_message>
<xml_diff>
--- a/README.docx
+++ b/README.docx
@@ -1333,7 +1333,19 @@
         <w:rPr>
           <w:rFonts w:hint="eastAsia"/>
         </w:rPr>
-        <w:t>Meta-analysis</w:t>
+        <w:t>Meta-</w:t>
+      </w:r>
+      <w:r>
+        <w:rPr>
+          <w:rFonts w:hint="eastAsia"/>
+        </w:rPr>
+        <w:t>A</w:t>
+      </w:r>
+      <w:r>
+        <w:rPr>
+          <w:rFonts w:hint="eastAsia"/>
+        </w:rPr>
+        <w:t>nalysis</w:t>
       </w:r>
     </w:p>
     <w:p>
@@ -1349,7 +1361,7 @@
         <w:rPr>
           <w:rFonts w:hint="eastAsia"/>
         </w:rPr>
-        <w:t>Cross-ancestry genetic correlation</w:t>
+        <w:t>Popcorn</w:t>
       </w:r>
     </w:p>
     <w:p>
@@ -1381,7 +1393,19 @@
         <w:rPr>
           <w:rFonts w:hint="eastAsia"/>
         </w:rPr>
-        <w:t>Fine-mapping</w:t>
+        <w:t>Fine-</w:t>
+      </w:r>
+      <w:r>
+        <w:rPr>
+          <w:rFonts w:hint="eastAsia"/>
+        </w:rPr>
+        <w:t>M</w:t>
+      </w:r>
+      <w:r>
+        <w:rPr>
+          <w:rFonts w:hint="eastAsia"/>
+        </w:rPr>
+        <w:t>apping</w:t>
       </w:r>
     </w:p>
     <w:p>
@@ -1404,17 +1428,11 @@
       <w:pPr>
         <w:pStyle w:val="ListParagraph"/>
         <w:numPr>
-          <w:ilvl w:val="0"/>
+          <w:ilvl w:val="1"/>
           <w:numId w:val="3"/>
         </w:numPr>
         <w:jc w:val="both"/>
       </w:pPr>
-      <w:r>
-        <w:rPr>
-          <w:rFonts w:hint="eastAsia"/>
-        </w:rPr>
-        <w:t>AR model</w:t>
-      </w:r>
     </w:p>
     <w:p>
       <w:pPr>
@@ -1429,7 +1447,67 @@
         <w:rPr>
           <w:rFonts w:hint="eastAsia"/>
         </w:rPr>
+        <w:t>AR model</w:t>
+      </w:r>
+    </w:p>
+    <w:p>
+      <w:pPr>
+        <w:pStyle w:val="ListParagraph"/>
+        <w:numPr>
+          <w:ilvl w:val="0"/>
+          <w:numId w:val="3"/>
+        </w:numPr>
+        <w:jc w:val="both"/>
+      </w:pPr>
+      <w:r>
+        <w:rPr>
+          <w:rFonts w:hint="eastAsia"/>
+        </w:rPr>
         <w:t>Survival Analysis Simulation</w:t>
+      </w:r>
+    </w:p>
+    <w:p>
+      <w:pPr>
+        <w:pStyle w:val="ListParagraph"/>
+        <w:numPr>
+          <w:ilvl w:val="0"/>
+          <w:numId w:val="3"/>
+        </w:numPr>
+        <w:jc w:val="both"/>
+      </w:pPr>
+      <w:r>
+        <w:rPr>
+          <w:rFonts w:hint="eastAsia"/>
+        </w:rPr>
+        <w:t xml:space="preserve">Other </w:t>
+      </w:r>
+      <w:r>
+        <w:rPr>
+          <w:rFonts w:hint="eastAsia"/>
+        </w:rPr>
+        <w:t>C</w:t>
+      </w:r>
+      <w:r>
+        <w:rPr>
+          <w:rFonts w:hint="eastAsia"/>
+        </w:rPr>
+        <w:t>odes</w:t>
+      </w:r>
+    </w:p>
+    <w:p>
+      <w:pPr>
+        <w:pStyle w:val="ListParagraph"/>
+        <w:numPr>
+          <w:ilvl w:val="1"/>
+          <w:numId w:val="3"/>
+        </w:numPr>
+        <w:jc w:val="both"/>
+      </w:pPr>
+      <w:r>
+        <w:rPr>
+          <w:rFonts w:hint="eastAsia"/>
+        </w:rPr>
+        <w:t>UpSet plot figure</w:t>
       </w:r>
     </w:p>
     <w:p>
@@ -1586,38 +1664,6 @@
       </w:pPr>
       <w:r>
         <w:t>This repository does not contain plug-and-play code. The code is provided to document our analytical procedures and facilitate assessment of the reproducibility of our approach. Because the underlying 23andMe GWAS summary statistics cannot be publicly shared, the analyses cannot be reproduced directly using the materials provided in this repository. Users with authorized access to the relevant data may need to modify file paths and other data-specific settings before running the code.</w:t>
-      </w:r>
-    </w:p>
-    <w:p>
-      <w:pPr>
-        <w:jc w:val="both"/>
-        <w:rPr>
-          <w:b/>
-          <w:bCs/>
-          <w:sz w:val="28"/>
-          <w:szCs w:val="28"/>
-        </w:rPr>
-      </w:pPr>
-      <w:r>
-        <w:rPr>
-          <w:rFonts w:hint="eastAsia"/>
-          <w:b/>
-          <w:bCs/>
-          <w:sz w:val="28"/>
-          <w:szCs w:val="28"/>
-        </w:rPr>
-        <w:t>Citation</w:t>
-      </w:r>
-    </w:p>
-    <w:p>
-      <w:pPr>
-        <w:jc w:val="both"/>
-      </w:pPr>
-      <w:r>
-        <w:rPr>
-          <w:rFonts w:hint="eastAsia"/>
-        </w:rPr>
-        <w:t>If you use code from this repository, please cite:</w:t>
       </w:r>
     </w:p>
     <w:p>

</xml_diff>